<commit_message>
fix(exp8): enlarge dashboard figures and typography with full-width 8-page layout
</commit_message>
<xml_diff>
--- a/documents/Experiment_8_Report.docx
+++ b/documents/Experiment_8_Report.docx
@@ -1003,7 +1003,7 @@
       <w:r>
         <w:drawing>
           <wp:inline xmlns:a="http://schemas.openxmlformats.org/drawingml/2006/main" xmlns:pic="http://schemas.openxmlformats.org/drawingml/2006/picture">
-            <wp:extent cx="6035040" cy="2377058"/>
+            <wp:extent cx="6035040" cy="3085729"/>
             <wp:docPr id="3" name="Picture 3"/>
             <wp:cNvGraphicFramePr>
               <a:graphicFrameLocks noChangeAspect="1"/>
@@ -1024,7 +1024,7 @@
                   <pic:spPr>
                     <a:xfrm>
                       <a:off x="0" y="0"/>
-                      <a:ext cx="6035040" cy="2377058"/>
+                      <a:ext cx="6035040" cy="3085729"/>
                     </a:xfrm>
                     <a:prstGeom prst="rect"/>
                   </pic:spPr>

</xml_diff>